<commit_message>
docs(lab3): insert real ci screenshots
</commit_message>
<xml_diff>
--- a/实验三_DevOps流水线与容器化部署/04_CICD配置与运行截图.docx
+++ b/实验三_DevOps流水线与容器化部署/04_CICD配置与运行截图.docx
@@ -1163,10 +1163,7 @@
           </w:tcPr>
           <w:p>
             <w:r>
-              <w:rPr>
-                <w:b w:val="0"/>
-              </w:rPr>
-              <w:t>截图要求：提交时请用 GitHub Actions 实机页面替换下列示例图。至少保留 1 张成功运行截图和 1 张失败/阻断案例截图，截图需能看到 workflow 名称、job 状态和关键步骤。</w:t>
+              <w:t>真实截图来源：GitHub Actions / lab3-ci。已包含一次成功运行、一次失败阻断案例和成功 job 步骤明细，能够证明 CI 具备运行记录、质量门禁和故障反馈。</w:t>
             </w:r>
           </w:p>
           <w:p>
@@ -1176,8 +1173,8 @@
             <w:r>
               <w:drawing>
                 <wp:inline xmlns:a="http://schemas.openxmlformats.org/drawingml/2006/main" xmlns:pic="http://schemas.openxmlformats.org/drawingml/2006/picture">
-                  <wp:extent cx="5120640" cy="3136392"/>
-                  <wp:docPr id="9" name="Picture 9"/>
+                  <wp:extent cx="5166360" cy="2936860"/>
+                  <wp:docPr id="13" name="Picture 13"/>
                   <wp:cNvGraphicFramePr>
                     <a:graphicFrameLocks noChangeAspect="1"/>
                   </wp:cNvGraphicFramePr>
@@ -1185,11 +1182,11 @@
                     <a:graphicData uri="http://schemas.openxmlformats.org/drawingml/2006/picture">
                       <pic:pic>
                         <pic:nvPicPr>
-                          <pic:cNvPr id="0" name="image.png"/>
+                          <pic:cNvPr id="0" name="lab3_real_actions_list.png"/>
                           <pic:cNvPicPr/>
                         </pic:nvPicPr>
                         <pic:blipFill>
-                          <a:blip r:embed="rId10"/>
+                          <a:blip r:embed="rId14"/>
                           <a:stretch>
                             <a:fillRect/>
                           </a:stretch>
@@ -1197,7 +1194,7 @@
                         <pic:spPr>
                           <a:xfrm>
                             <a:off x="0" y="0"/>
-                            <a:ext cx="5120640" cy="3136392"/>
+                            <a:ext cx="5166360" cy="2936860"/>
                           </a:xfrm>
                           <a:prstGeom prst="rect"/>
                         </pic:spPr>
@@ -1213,7 +1210,7 @@
               <w:jc w:val="center"/>
             </w:pPr>
             <w:r>
-              <w:t>图3-3a CI 成功运行截图（示例，提交前替换为 GitHub Actions 实机截图）</w:t>
+              <w:t>图3-3a lab3-ci 工作流运行列表（真实截图）</w:t>
             </w:r>
           </w:p>
           <w:p>
@@ -1223,8 +1220,8 @@
             <w:r>
               <w:drawing>
                 <wp:inline xmlns:a="http://schemas.openxmlformats.org/drawingml/2006/main" xmlns:pic="http://schemas.openxmlformats.org/drawingml/2006/picture">
-                  <wp:extent cx="5120640" cy="3136392"/>
-                  <wp:docPr id="10" name="Picture 10"/>
+                  <wp:extent cx="5166360" cy="3101032"/>
+                  <wp:docPr id="14" name="Picture 14"/>
                   <wp:cNvGraphicFramePr>
                     <a:graphicFrameLocks noChangeAspect="1"/>
                   </wp:cNvGraphicFramePr>
@@ -1232,11 +1229,11 @@
                     <a:graphicData uri="http://schemas.openxmlformats.org/drawingml/2006/picture">
                       <pic:pic>
                         <pic:nvPicPr>
-                          <pic:cNvPr id="0" name="image.png"/>
+                          <pic:cNvPr id="0" name="lab3_real_ci_success_summary.png"/>
                           <pic:cNvPicPr/>
                         </pic:nvPicPr>
                         <pic:blipFill>
-                          <a:blip r:embed="rId11"/>
+                          <a:blip r:embed="rId15"/>
                           <a:stretch>
                             <a:fillRect/>
                           </a:stretch>
@@ -1244,7 +1241,7 @@
                         <pic:spPr>
                           <a:xfrm>
                             <a:off x="0" y="0"/>
-                            <a:ext cx="5120640" cy="3136392"/>
+                            <a:ext cx="5166360" cy="3101032"/>
                           </a:xfrm>
                           <a:prstGeom prst="rect"/>
                         </pic:spPr>
@@ -1260,7 +1257,101 @@
               <w:jc w:val="center"/>
             </w:pPr>
             <w:r>
-              <w:t>图3-3b CI 失败阻断截图（示例，提交前替换为 GitHub Actions 实机截图）</w:t>
+              <w:t>图3-3b lab3-ci 成功运行 Summary（真实截图）</w:t>
+            </w:r>
+          </w:p>
+          <w:p>
+            <w:pPr>
+              <w:jc w:val="center"/>
+            </w:pPr>
+            <w:r>
+              <w:drawing>
+                <wp:inline xmlns:a="http://schemas.openxmlformats.org/drawingml/2006/main" xmlns:pic="http://schemas.openxmlformats.org/drawingml/2006/picture">
+                  <wp:extent cx="5166360" cy="3113193"/>
+                  <wp:docPr id="15" name="Picture 15"/>
+                  <wp:cNvGraphicFramePr>
+                    <a:graphicFrameLocks noChangeAspect="1"/>
+                  </wp:cNvGraphicFramePr>
+                  <a:graphic>
+                    <a:graphicData uri="http://schemas.openxmlformats.org/drawingml/2006/picture">
+                      <pic:pic>
+                        <pic:nvPicPr>
+                          <pic:cNvPr id="0" name="lab3_real_ci_success_steps.png"/>
+                          <pic:cNvPicPr/>
+                        </pic:nvPicPr>
+                        <pic:blipFill>
+                          <a:blip r:embed="rId16"/>
+                          <a:stretch>
+                            <a:fillRect/>
+                          </a:stretch>
+                        </pic:blipFill>
+                        <pic:spPr>
+                          <a:xfrm>
+                            <a:off x="0" y="0"/>
+                            <a:ext cx="5166360" cy="3113193"/>
+                          </a:xfrm>
+                          <a:prstGeom prst="rect"/>
+                        </pic:spPr>
+                      </pic:pic>
+                    </a:graphicData>
+                  </a:graphic>
+                </wp:inline>
+              </w:drawing>
+            </w:r>
+          </w:p>
+          <w:p>
+            <w:pPr>
+              <w:jc w:val="center"/>
+            </w:pPr>
+            <w:r>
+              <w:t>图3-3c quality job 成功步骤明细（真实截图）</w:t>
+            </w:r>
+          </w:p>
+          <w:p>
+            <w:pPr>
+              <w:jc w:val="center"/>
+            </w:pPr>
+            <w:r>
+              <w:drawing>
+                <wp:inline xmlns:a="http://schemas.openxmlformats.org/drawingml/2006/main" xmlns:pic="http://schemas.openxmlformats.org/drawingml/2006/picture">
+                  <wp:extent cx="5166360" cy="3113193"/>
+                  <wp:docPr id="16" name="Picture 16"/>
+                  <wp:cNvGraphicFramePr>
+                    <a:graphicFrameLocks noChangeAspect="1"/>
+                  </wp:cNvGraphicFramePr>
+                  <a:graphic>
+                    <a:graphicData uri="http://schemas.openxmlformats.org/drawingml/2006/picture">
+                      <pic:pic>
+                        <pic:nvPicPr>
+                          <pic:cNvPr id="0" name="lab3_real_ci_failure_summary.png"/>
+                          <pic:cNvPicPr/>
+                        </pic:nvPicPr>
+                        <pic:blipFill>
+                          <a:blip r:embed="rId17"/>
+                          <a:stretch>
+                            <a:fillRect/>
+                          </a:stretch>
+                        </pic:blipFill>
+                        <pic:spPr>
+                          <a:xfrm>
+                            <a:off x="0" y="0"/>
+                            <a:ext cx="5166360" cy="3113193"/>
+                          </a:xfrm>
+                          <a:prstGeom prst="rect"/>
+                        </pic:spPr>
+                      </pic:pic>
+                    </a:graphicData>
+                  </a:graphic>
+                </wp:inline>
+              </w:drawing>
+            </w:r>
+          </w:p>
+          <w:p>
+            <w:pPr>
+              <w:jc w:val="center"/>
+            </w:pPr>
+            <w:r>
+              <w:t>图3-3d lab3-ci 失败阻断案例（真实截图）</w:t>
             </w:r>
           </w:p>
         </w:tc>
@@ -1711,10 +1802,7 @@
           </w:tcPr>
           <w:p>
             <w:r>
-              <w:rPr>
-                <w:b w:val="0"/>
-              </w:rPr>
-              <w:t>截图要求：CD 部分建议截取 Environments 审批页、workflow_dispatch 输入页、Helm rollout 成功页、Prometheus 阈值通过或 rollback 页。下列示例图用于说明截图构图，提交前用实机页面替换。</w:t>
+              <w:t>lab3-cd 未在当前 Actions 侧边栏显示的原因：该 workflow 原先只有 workflow_dispatch 且尚无运行记录；GitHub 侧边栏通常只展示已运行或默认分支可发现的 workflow。已将 lab3-cd 调整为 push 也会触发，后续刷新 Actions 后可截取 CD 运行记录。当前保留下列 CD 示例图作为截图构图参考，提交前可用 lab3-cd 实机截图替换。</w:t>
             </w:r>
           </w:p>
           <w:p>
@@ -1724,8 +1812,8 @@
             <w:r>
               <w:drawing>
                 <wp:inline xmlns:a="http://schemas.openxmlformats.org/drawingml/2006/main" xmlns:pic="http://schemas.openxmlformats.org/drawingml/2006/picture">
-                  <wp:extent cx="5120640" cy="3136392"/>
-                  <wp:docPr id="11" name="Picture 11"/>
+                  <wp:extent cx="5074920" cy="3108388"/>
+                  <wp:docPr id="17" name="Picture 17"/>
                   <wp:cNvGraphicFramePr>
                     <a:graphicFrameLocks noChangeAspect="1"/>
                   </wp:cNvGraphicFramePr>
@@ -1745,7 +1833,7 @@
                         <pic:spPr>
                           <a:xfrm>
                             <a:off x="0" y="0"/>
-                            <a:ext cx="5120640" cy="3136392"/>
+                            <a:ext cx="5074920" cy="3108388"/>
                           </a:xfrm>
                           <a:prstGeom prst="rect"/>
                         </pic:spPr>
@@ -1761,7 +1849,7 @@
               <w:jc w:val="center"/>
             </w:pPr>
             <w:r>
-              <w:t>图3-3c CD 环境审批截图（示例，提交前替换为 GitHub Actions 实机截图）</w:t>
+              <w:t>图3-3e CD 环境审批截图（示例，待 lab3-cd 实机截图替换）</w:t>
             </w:r>
           </w:p>
           <w:p>
@@ -1771,8 +1859,8 @@
             <w:r>
               <w:drawing>
                 <wp:inline xmlns:a="http://schemas.openxmlformats.org/drawingml/2006/main" xmlns:pic="http://schemas.openxmlformats.org/drawingml/2006/picture">
-                  <wp:extent cx="5120640" cy="3136392"/>
-                  <wp:docPr id="12" name="Picture 12"/>
+                  <wp:extent cx="5074920" cy="3108388"/>
+                  <wp:docPr id="18" name="Picture 18"/>
                   <wp:cNvGraphicFramePr>
                     <a:graphicFrameLocks noChangeAspect="1"/>
                   </wp:cNvGraphicFramePr>
@@ -1792,7 +1880,7 @@
                         <pic:spPr>
                           <a:xfrm>
                             <a:off x="0" y="0"/>
-                            <a:ext cx="5120640" cy="3136392"/>
+                            <a:ext cx="5074920" cy="3108388"/>
                           </a:xfrm>
                           <a:prstGeom prst="rect"/>
                         </pic:spPr>
@@ -1808,7 +1896,7 @@
               <w:jc w:val="center"/>
             </w:pPr>
             <w:r>
-              <w:t>图3-3d CD 灰度发布与质量门禁截图（示例，提交前替换为 GitHub Actions 实机截图）</w:t>
+              <w:t>图3-3f CD 灰度发布与质量门禁截图（示例，待 lab3-cd 实机截图替换）</w:t>
             </w:r>
           </w:p>
         </w:tc>

</xml_diff>